<commit_message>
Backup DiÃ¡rio AutomÃ¡tico: 2026-03-04 18:00:03
</commit_message>
<xml_diff>
--- a/modelos_prod/ModeloPropostaAvulso.docx
+++ b/modelos_prod/ModeloPropostaAvulso.docx
@@ -19,38 +19,18 @@
           <w:sz w:val="32"/>
           <w:szCs w:val="32"/>
         </w:rPr>
-        <w:t>Proposta de Serviços – ${</w:t>
-      </w:r>
-      <w:proofErr w:type="spellStart"/>
-      <w:r>
+        <w:t>Proposta de Serviços – ${tipo_levantamento}</w:t>
+      </w:r>
+    </w:p>
+    <w:p>
+      <w:pPr>
+        <w:jc w:val="center"/>
         <w:rPr>
           <w:b/>
           <w:bCs/>
           <w:sz w:val="32"/>
           <w:szCs w:val="32"/>
         </w:rPr>
-        <w:t>tipo_levantamento</w:t>
-      </w:r>
-      <w:proofErr w:type="spellEnd"/>
-      <w:r>
-        <w:rPr>
-          <w:b/>
-          <w:bCs/>
-          <w:sz w:val="32"/>
-          <w:szCs w:val="32"/>
-        </w:rPr>
-        <w:t>}</w:t>
-      </w:r>
-    </w:p>
-    <w:p>
-      <w:pPr>
-        <w:jc w:val="center"/>
-        <w:rPr>
-          <w:b/>
-          <w:bCs/>
-          <w:sz w:val="32"/>
-          <w:szCs w:val="32"/>
-        </w:rPr>
       </w:pPr>
     </w:p>
     <w:p>
@@ -66,53 +46,24 @@
           <w:b/>
           <w:bCs/>
         </w:rPr>
-        <w:t>Proposta Nº: ${</w:t>
-      </w:r>
-      <w:proofErr w:type="spellStart"/>
-      <w:r>
-        <w:rPr>
-          <w:b/>
-          <w:bCs/>
-        </w:rPr>
-        <w:t>numero_proposta</w:t>
-      </w:r>
-      <w:proofErr w:type="spellEnd"/>
-      <w:r>
-        <w:rPr>
-          <w:b/>
-          <w:bCs/>
-        </w:rPr>
-        <w:t>}</w:t>
-      </w:r>
-    </w:p>
-    <w:p>
+        <w:t>Proposta Nº: ${numero_proposta}</w:t>
+      </w:r>
+    </w:p>
+    <w:p>
+      <w:r>
+        <w:t>${Cidade}</w:t>
+      </w:r>
+      <w:r>
+        <w:t xml:space="preserve"> </w:t>
+      </w:r>
+      <w:r>
+        <w:t xml:space="preserve"> </w:t>
+      </w:r>
       <w:r>
         <w:t>${</w:t>
       </w:r>
-      <w:proofErr w:type="gramStart"/>
-      <w:r>
-        <w:t>Cidade}</w:t>
-      </w:r>
-      <w:r>
-        <w:t xml:space="preserve"> </w:t>
-      </w:r>
-      <w:r>
-        <w:t xml:space="preserve"> </w:t>
-      </w:r>
-      <w:r>
-        <w:t>$</w:t>
-      </w:r>
-      <w:proofErr w:type="gramEnd"/>
-      <w:r>
-        <w:t>{</w:t>
-      </w:r>
-      <w:proofErr w:type="spellStart"/>
-      <w:r>
-        <w:t>DExrenso</w:t>
-      </w:r>
-      <w:proofErr w:type="spellEnd"/>
-      <w:r>
-        <w:t>}</w:t>
+      <w:r>
+        <w:t>DExrenso}</w:t>
       </w:r>
     </w:p>
     <w:p>
@@ -131,18 +82,12 @@
       </w:pPr>
       <w:r>
         <w:rPr>
-          <w:rFonts w:ascii="Segoe UI Emoji" w:hAnsi="Segoe UI Emoji" w:cs="Segoe UI Emoji"/>
-          <w:b/>
-          <w:bCs/>
-        </w:rPr>
-        <w:t>📌</w:t>
-      </w:r>
-      <w:r>
-        <w:rPr>
-          <w:b/>
-          <w:bCs/>
-        </w:rPr>
-        <w:t xml:space="preserve"> Dados do Cliente</w:t>
+          <w:b/>
+          <w:bCs/>
+          <w:sz w:val="32"/>
+          <w:szCs w:val="32"/>
+        </w:rPr>
+        <w:t>Dados do Cliente</w:t>
       </w:r>
     </w:p>
     <w:p>
@@ -161,15 +106,7 @@
         <w:t>Nome:</w:t>
       </w:r>
       <w:r>
-        <w:t xml:space="preserve"> ${</w:t>
-      </w:r>
-      <w:proofErr w:type="spellStart"/>
-      <w:r>
-        <w:t>nome_cliente_salvo</w:t>
-      </w:r>
-      <w:proofErr w:type="spellEnd"/>
-      <w:r>
-        <w:t>}</w:t>
+        <w:t xml:space="preserve"> ${nome_cliente_salvo}</w:t>
       </w:r>
     </w:p>
     <w:p>
@@ -188,15 +125,7 @@
         <w:t>E-mail:</w:t>
       </w:r>
       <w:r>
-        <w:t xml:space="preserve"> ${</w:t>
-      </w:r>
-      <w:proofErr w:type="spellStart"/>
-      <w:r>
-        <w:t>email_salvo</w:t>
-      </w:r>
-      <w:proofErr w:type="spellEnd"/>
-      <w:r>
-        <w:t>}</w:t>
+        <w:t xml:space="preserve"> ${email_salvo}</w:t>
       </w:r>
     </w:p>
     <w:p>
@@ -215,15 +144,7 @@
         <w:t>Telefone:</w:t>
       </w:r>
       <w:r>
-        <w:t xml:space="preserve"> ${</w:t>
-      </w:r>
-      <w:proofErr w:type="spellStart"/>
-      <w:r>
-        <w:t>telefone_salvo</w:t>
-      </w:r>
-      <w:proofErr w:type="spellEnd"/>
-      <w:r>
-        <w:t>}</w:t>
+        <w:t xml:space="preserve"> ${telefone_salvo}</w:t>
       </w:r>
     </w:p>
     <w:p>
@@ -242,15 +163,7 @@
         <w:t>Celular:</w:t>
       </w:r>
       <w:r>
-        <w:t xml:space="preserve"> ${</w:t>
-      </w:r>
-      <w:proofErr w:type="spellStart"/>
-      <w:r>
-        <w:t>celular_salvo</w:t>
-      </w:r>
-      <w:proofErr w:type="spellEnd"/>
-      <w:r>
-        <w:t>}</w:t>
+        <w:t xml:space="preserve"> ${celular_salvo}</w:t>
       </w:r>
     </w:p>
     <w:p>
@@ -269,15 +182,7 @@
         <w:t>WhatsApp:</w:t>
       </w:r>
       <w:r>
-        <w:t xml:space="preserve"> ${</w:t>
-      </w:r>
-      <w:proofErr w:type="spellStart"/>
-      <w:r>
-        <w:t>whatsapp_salvo</w:t>
-      </w:r>
-      <w:proofErr w:type="spellEnd"/>
-      <w:r>
-        <w:t>}</w:t>
+        <w:t xml:space="preserve"> ${whatsapp_salvo}</w:t>
       </w:r>
     </w:p>
     <w:p>
@@ -293,14 +198,16 @@
           <w:b/>
           <w:bCs/>
         </w:rPr>
-        <w:t>📍</w:t>
-      </w:r>
-      <w:r>
-        <w:rPr>
-          <w:b/>
-          <w:bCs/>
-        </w:rPr>
-        <w:t xml:space="preserve"> Local da Obra</w:t>
+        <w:t xml:space="preserve">   </w:t>
+      </w:r>
+      <w:r>
+        <w:rPr>
+          <w:b/>
+          <w:bCs/>
+          <w:sz w:val="32"/>
+          <w:szCs w:val="32"/>
+        </w:rPr>
+        <w:t>Local da Obra</w:t>
       </w:r>
     </w:p>
     <w:p>
@@ -319,15 +226,7 @@
         <w:t>Endereço:</w:t>
       </w:r>
       <w:r>
-        <w:t xml:space="preserve"> ${</w:t>
-      </w:r>
-      <w:proofErr w:type="spellStart"/>
-      <w:r>
-        <w:t>endereco_obra</w:t>
-      </w:r>
-      <w:proofErr w:type="spellEnd"/>
-      <w:r>
-        <w:t>}</w:t>
+        <w:t xml:space="preserve"> ${endereco_obra}</w:t>
       </w:r>
     </w:p>
     <w:p>
@@ -346,15 +245,7 @@
         <w:t>Bairro:</w:t>
       </w:r>
       <w:r>
-        <w:t xml:space="preserve"> ${</w:t>
-      </w:r>
-      <w:proofErr w:type="spellStart"/>
-      <w:r>
-        <w:t>bairro_obra</w:t>
-      </w:r>
-      <w:proofErr w:type="spellEnd"/>
-      <w:r>
-        <w:t>}</w:t>
+        <w:t xml:space="preserve"> ${bairro_obra}</w:t>
       </w:r>
     </w:p>
     <w:p>
@@ -373,15 +264,7 @@
         <w:t>Cidade:</w:t>
       </w:r>
       <w:r>
-        <w:t xml:space="preserve"> ${</w:t>
-      </w:r>
-      <w:proofErr w:type="spellStart"/>
-      <w:r>
-        <w:t>cidade_obra</w:t>
-      </w:r>
-      <w:proofErr w:type="spellEnd"/>
-      <w:r>
-        <w:t>}</w:t>
+        <w:t xml:space="preserve"> ${cidade_obra}</w:t>
       </w:r>
     </w:p>
     <w:p>
@@ -400,15 +283,7 @@
         <w:t>Estado:</w:t>
       </w:r>
       <w:r>
-        <w:t xml:space="preserve"> ${</w:t>
-      </w:r>
-      <w:proofErr w:type="spellStart"/>
-      <w:r>
-        <w:t>estado_obra</w:t>
-      </w:r>
-      <w:proofErr w:type="spellEnd"/>
-      <w:r>
-        <w:t>}</w:t>
+        <w:t xml:space="preserve"> ${estado_obra}</w:t>
       </w:r>
     </w:p>
     <w:p>
@@ -490,7 +365,17 @@
       </w:r>
     </w:p>
     <w:p>
-      <w:r>
+      <w:pPr>
+        <w:rPr>
+          <w:i/>
+          <w:iCs/>
+        </w:rPr>
+      </w:pPr>
+      <w:r>
+        <w:rPr>
+          <w:i/>
+          <w:iCs/>
+        </w:rPr>
         <w:t>${finalidade}</w:t>
       </w:r>
     </w:p>
@@ -639,15 +524,7 @@
         <w:t>Tipo de Levantamento:</w:t>
       </w:r>
       <w:r>
-        <w:t xml:space="preserve"> ${</w:t>
-      </w:r>
-      <w:proofErr w:type="spellStart"/>
-      <w:r>
-        <w:t>tipo_levantamento</w:t>
-      </w:r>
-      <w:proofErr w:type="spellEnd"/>
-      <w:r>
-        <w:t>}</w:t>
+        <w:t xml:space="preserve"> ${tipo_levantamento}</w:t>
       </w:r>
       <w:r>
         <w:br/>
@@ -669,15 +546,7 @@
         <w:t>Área do Imóvel:</w:t>
       </w:r>
       <w:r>
-        <w:t xml:space="preserve"> ${</w:t>
-      </w:r>
-      <w:proofErr w:type="spellStart"/>
-      <w:r>
-        <w:t>area_obra</w:t>
-      </w:r>
-      <w:proofErr w:type="spellEnd"/>
-      <w:r>
-        <w:t>}</w:t>
+        <w:t xml:space="preserve"> ${area_obra}</w:t>
       </w:r>
     </w:p>
     <w:p>
@@ -745,15 +614,7 @@
         </w:numPr>
       </w:pPr>
       <w:r>
-        <w:t xml:space="preserve">Medição de ângulos e distâncias com Estação Total </w:t>
-      </w:r>
-      <w:proofErr w:type="spellStart"/>
-      <w:r>
-        <w:t>Leica</w:t>
-      </w:r>
-      <w:proofErr w:type="spellEnd"/>
-      <w:r>
-        <w:t xml:space="preserve"> TS-02.</w:t>
+        <w:t>Medição de ângulos e distâncias com Estação Total Leica TS-02.</w:t>
       </w:r>
     </w:p>
     <w:p>
@@ -826,7 +687,6 @@
         </w:numPr>
       </w:pPr>
       <w:r>
-        <w:lastRenderedPageBreak/>
         <w:t>Memorial Descritivo detalhado.</w:t>
       </w:r>
     </w:p>
@@ -838,6 +698,7 @@
         </w:numPr>
       </w:pPr>
       <w:r>
+        <w:lastRenderedPageBreak/>
         <w:t>Laudo Técnico Conclusivo.</w:t>
       </w:r>
     </w:p>
@@ -911,20 +772,7 @@
         <w:t>Estação Total:</w:t>
       </w:r>
       <w:r>
-        <w:t xml:space="preserve"> ${</w:t>
-      </w:r>
-      <w:proofErr w:type="spellStart"/>
-      <w:r>
-        <w:t>Estacao</w:t>
-      </w:r>
-      <w:proofErr w:type="gramStart"/>
-      <w:r>
-        <w:t>_Total</w:t>
-      </w:r>
-      <w:proofErr w:type="spellEnd"/>
-      <w:proofErr w:type="gramEnd"/>
-      <w:r>
-        <w:t>}</w:t>
+        <w:t xml:space="preserve"> ${Estacao_Total}</w:t>
       </w:r>
     </w:p>
     <w:p>
@@ -997,39 +845,7 @@
           <w:b/>
           <w:bCs/>
         </w:rPr>
-        <w:t>${</w:t>
-      </w:r>
-      <w:proofErr w:type="spellStart"/>
-      <w:r>
-        <w:rPr>
-          <w:b/>
-          <w:bCs/>
-        </w:rPr>
-        <w:t>ValorProposta</w:t>
-      </w:r>
-      <w:proofErr w:type="spellEnd"/>
-      <w:r>
-        <w:rPr>
-          <w:b/>
-          <w:bCs/>
-        </w:rPr>
-        <w:t>} (${</w:t>
-      </w:r>
-      <w:proofErr w:type="spellStart"/>
-      <w:r>
-        <w:rPr>
-          <w:b/>
-          <w:bCs/>
-        </w:rPr>
-        <w:t>ValorExtenso</w:t>
-      </w:r>
-      <w:proofErr w:type="spellEnd"/>
-      <w:r>
-        <w:rPr>
-          <w:b/>
-          <w:bCs/>
-        </w:rPr>
-        <w:t>})</w:t>
+        <w:t>${ValorProposta} (${ValorExtenso})</w:t>
       </w:r>
     </w:p>
     <w:p>
@@ -1097,31 +913,7 @@
         <w:t>Mobilização:</w:t>
       </w:r>
       <w:r>
-        <w:t xml:space="preserve"> ${</w:t>
-      </w:r>
-      <w:proofErr w:type="spellStart"/>
-      <w:r>
-        <w:t>mobilizacao_</w:t>
-      </w:r>
-      <w:proofErr w:type="gramStart"/>
-      <w:r>
-        <w:t>percentual</w:t>
-      </w:r>
-      <w:proofErr w:type="spellEnd"/>
-      <w:r>
-        <w:t>}%</w:t>
-      </w:r>
-      <w:proofErr w:type="gramEnd"/>
-      <w:r>
-        <w:t xml:space="preserve"> –  ${</w:t>
-      </w:r>
-      <w:proofErr w:type="spellStart"/>
-      <w:r>
-        <w:t>mobilizacao_valor</w:t>
-      </w:r>
-      <w:proofErr w:type="spellEnd"/>
-      <w:r>
-        <w:t>}</w:t>
+        <w:t xml:space="preserve"> ${mobilizacao_percentual}% –  ${mobilizacao_valor}</w:t>
       </w:r>
       <w:r>
         <w:br/>
@@ -1149,31 +941,7 @@
         <w:t>Restante:</w:t>
       </w:r>
       <w:r>
-        <w:t xml:space="preserve"> ${</w:t>
-      </w:r>
-      <w:proofErr w:type="spellStart"/>
-      <w:r>
-        <w:t>restante_</w:t>
-      </w:r>
-      <w:proofErr w:type="gramStart"/>
-      <w:r>
-        <w:t>percentual</w:t>
-      </w:r>
-      <w:proofErr w:type="spellEnd"/>
-      <w:r>
-        <w:t>}%</w:t>
-      </w:r>
-      <w:proofErr w:type="gramEnd"/>
-      <w:r>
-        <w:t xml:space="preserve"> –  ${</w:t>
-      </w:r>
-      <w:proofErr w:type="spellStart"/>
-      <w:r>
-        <w:t>restante_valor</w:t>
-      </w:r>
-      <w:proofErr w:type="spellEnd"/>
-      <w:r>
-        <w:t>}</w:t>
+        <w:t xml:space="preserve"> ${restante_percentual}% –  ${restante_valor}</w:t>
       </w:r>
       <w:r>
         <w:br/>
@@ -1238,7 +1006,6 @@
           <w:b/>
           <w:bCs/>
         </w:rPr>
-        <w:lastRenderedPageBreak/>
         <w:t>Agência:</w:t>
       </w:r>
       <w:r>
@@ -1275,6 +1042,7 @@
           <w:b/>
           <w:bCs/>
         </w:rPr>
+        <w:lastRenderedPageBreak/>
         <w:t>Titular:</w:t>
       </w:r>
       <w:r>
@@ -1410,15 +1178,7 @@
         <w:t>📞</w:t>
       </w:r>
       <w:r>
-        <w:t xml:space="preserve"> Contato: ${</w:t>
-      </w:r>
-      <w:proofErr w:type="spellStart"/>
-      <w:r>
-        <w:t>whatsapp</w:t>
-      </w:r>
-      <w:proofErr w:type="spellEnd"/>
-      <w:r>
-        <w:t>} (WhatsApp)</w:t>
+        <w:t xml:space="preserve"> Contato: ${whatsapp} (WhatsApp)</w:t>
       </w:r>
     </w:p>
     <w:p>
@@ -1494,61 +1254,7 @@
         <w:b/>
         <w:bCs/>
       </w:rPr>
-      <w:t>${</w:t>
-    </w:r>
-    <w:proofErr w:type="spellStart"/>
-    <w:r>
-      <w:rPr>
-        <w:rFonts w:ascii="Arial" w:hAnsi="Arial" w:cs="Arial"/>
-        <w:b/>
-        <w:bCs/>
-      </w:rPr>
-      <w:t>empresa_proponente_nome</w:t>
-    </w:r>
-    <w:proofErr w:type="spellEnd"/>
-    <w:r>
-      <w:rPr>
-        <w:rFonts w:ascii="Arial" w:hAnsi="Arial" w:cs="Arial"/>
-        <w:b/>
-        <w:bCs/>
-      </w:rPr>
-      <w:t>} | ${</w:t>
-    </w:r>
-    <w:proofErr w:type="spellStart"/>
-    <w:r>
-      <w:rPr>
-        <w:rFonts w:ascii="Arial" w:hAnsi="Arial" w:cs="Arial"/>
-        <w:b/>
-        <w:bCs/>
-      </w:rPr>
-      <w:t>empresa_proponente_</w:t>
-    </w:r>
-    <w:proofErr w:type="gramStart"/>
-    <w:r>
-      <w:rPr>
-        <w:rFonts w:ascii="Arial" w:hAnsi="Arial" w:cs="Arial"/>
-        <w:b/>
-        <w:bCs/>
-      </w:rPr>
-      <w:t>cidade</w:t>
-    </w:r>
-    <w:proofErr w:type="spellEnd"/>
-    <w:r>
-      <w:rPr>
-        <w:rFonts w:ascii="Arial" w:hAnsi="Arial" w:cs="Arial"/>
-        <w:b/>
-        <w:bCs/>
-      </w:rPr>
-      <w:t xml:space="preserve">}   </w:t>
-    </w:r>
-    <w:proofErr w:type="gramEnd"/>
-    <w:r>
-      <w:rPr>
-        <w:rFonts w:ascii="Arial" w:hAnsi="Arial" w:cs="Arial"/>
-        <w:b/>
-        <w:bCs/>
-      </w:rPr>
-      <w:t>|  Levantamentos Topográficos • Georreferenciamento • Projetos • Segurança Jurídica e Técnica.</w:t>
+      <w:t xml:space="preserve">${empresa_proponente_nome} | ${empresa_proponente_cidade}   |  </w:t>
     </w:r>
   </w:p>
 </w:ftr>
@@ -1584,18 +1290,9 @@
   <w:p>
     <w:pPr>
       <w:pStyle w:val="Cabealho"/>
-      <w:jc w:val="center"/>
     </w:pPr>
     <w:r>
-      <w:t>${</w:t>
-    </w:r>
-    <w:proofErr w:type="spellStart"/>
-    <w:r>
-      <w:t>logo_empresa</w:t>
-    </w:r>
-    <w:proofErr w:type="spellEnd"/>
-    <w:r>
-      <w:t>} </w:t>
+      <w:t>${logo_empresa} </w:t>
     </w:r>
   </w:p>
 </w:hdr>
@@ -2051,6 +1748,119 @@
     </w:lvl>
   </w:abstractNum>
   <w:abstractNum w:abstractNumId="3" w15:restartNumberingAfterBreak="0">
+    <w:nsid w:val="28DA5E88"/>
+    <w:multiLevelType w:val="hybridMultilevel"/>
+    <w:tmpl w:val="816C9E8E"/>
+    <w:lvl w:ilvl="0" w:tplc="04160001">
+      <w:start w:val="1"/>
+      <w:numFmt w:val="bullet"/>
+      <w:lvlText w:val=""/>
+      <w:lvlJc w:val="left"/>
+      <w:pPr>
+        <w:ind w:left="720" w:hanging="360"/>
+      </w:pPr>
+      <w:rPr>
+        <w:rFonts w:ascii="Symbol" w:hAnsi="Symbol" w:hint="default"/>
+      </w:rPr>
+    </w:lvl>
+    <w:lvl w:ilvl="1" w:tplc="04160003" w:tentative="1">
+      <w:start w:val="1"/>
+      <w:numFmt w:val="bullet"/>
+      <w:lvlText w:val="o"/>
+      <w:lvlJc w:val="left"/>
+      <w:pPr>
+        <w:ind w:left="1440" w:hanging="360"/>
+      </w:pPr>
+      <w:rPr>
+        <w:rFonts w:ascii="Courier New" w:hAnsi="Courier New" w:cs="Courier New" w:hint="default"/>
+      </w:rPr>
+    </w:lvl>
+    <w:lvl w:ilvl="2" w:tplc="04160005" w:tentative="1">
+      <w:start w:val="1"/>
+      <w:numFmt w:val="bullet"/>
+      <w:lvlText w:val=""/>
+      <w:lvlJc w:val="left"/>
+      <w:pPr>
+        <w:ind w:left="2160" w:hanging="360"/>
+      </w:pPr>
+      <w:rPr>
+        <w:rFonts w:ascii="Wingdings" w:hAnsi="Wingdings" w:hint="default"/>
+      </w:rPr>
+    </w:lvl>
+    <w:lvl w:ilvl="3" w:tplc="04160001" w:tentative="1">
+      <w:start w:val="1"/>
+      <w:numFmt w:val="bullet"/>
+      <w:lvlText w:val=""/>
+      <w:lvlJc w:val="left"/>
+      <w:pPr>
+        <w:ind w:left="2880" w:hanging="360"/>
+      </w:pPr>
+      <w:rPr>
+        <w:rFonts w:ascii="Symbol" w:hAnsi="Symbol" w:hint="default"/>
+      </w:rPr>
+    </w:lvl>
+    <w:lvl w:ilvl="4" w:tplc="04160003" w:tentative="1">
+      <w:start w:val="1"/>
+      <w:numFmt w:val="bullet"/>
+      <w:lvlText w:val="o"/>
+      <w:lvlJc w:val="left"/>
+      <w:pPr>
+        <w:ind w:left="3600" w:hanging="360"/>
+      </w:pPr>
+      <w:rPr>
+        <w:rFonts w:ascii="Courier New" w:hAnsi="Courier New" w:cs="Courier New" w:hint="default"/>
+      </w:rPr>
+    </w:lvl>
+    <w:lvl w:ilvl="5" w:tplc="04160005" w:tentative="1">
+      <w:start w:val="1"/>
+      <w:numFmt w:val="bullet"/>
+      <w:lvlText w:val=""/>
+      <w:lvlJc w:val="left"/>
+      <w:pPr>
+        <w:ind w:left="4320" w:hanging="360"/>
+      </w:pPr>
+      <w:rPr>
+        <w:rFonts w:ascii="Wingdings" w:hAnsi="Wingdings" w:hint="default"/>
+      </w:rPr>
+    </w:lvl>
+    <w:lvl w:ilvl="6" w:tplc="04160001" w:tentative="1">
+      <w:start w:val="1"/>
+      <w:numFmt w:val="bullet"/>
+      <w:lvlText w:val=""/>
+      <w:lvlJc w:val="left"/>
+      <w:pPr>
+        <w:ind w:left="5040" w:hanging="360"/>
+      </w:pPr>
+      <w:rPr>
+        <w:rFonts w:ascii="Symbol" w:hAnsi="Symbol" w:hint="default"/>
+      </w:rPr>
+    </w:lvl>
+    <w:lvl w:ilvl="7" w:tplc="04160003" w:tentative="1">
+      <w:start w:val="1"/>
+      <w:numFmt w:val="bullet"/>
+      <w:lvlText w:val="o"/>
+      <w:lvlJc w:val="left"/>
+      <w:pPr>
+        <w:ind w:left="5760" w:hanging="360"/>
+      </w:pPr>
+      <w:rPr>
+        <w:rFonts w:ascii="Courier New" w:hAnsi="Courier New" w:cs="Courier New" w:hint="default"/>
+      </w:rPr>
+    </w:lvl>
+    <w:lvl w:ilvl="8" w:tplc="04160005" w:tentative="1">
+      <w:start w:val="1"/>
+      <w:numFmt w:val="bullet"/>
+      <w:lvlText w:val=""/>
+      <w:lvlJc w:val="left"/>
+      <w:pPr>
+        <w:ind w:left="6480" w:hanging="360"/>
+      </w:pPr>
+      <w:rPr>
+        <w:rFonts w:ascii="Wingdings" w:hAnsi="Wingdings" w:hint="default"/>
+      </w:rPr>
+    </w:lvl>
+  </w:abstractNum>
+  <w:abstractNum w:abstractNumId="4" w15:restartNumberingAfterBreak="0">
     <w:nsid w:val="3A8D02C8"/>
     <w:multiLevelType w:val="multilevel"/>
     <w:tmpl w:val="B47EC3DA"/>
@@ -2199,7 +2009,7 @@
       </w:rPr>
     </w:lvl>
   </w:abstractNum>
-  <w:abstractNum w:abstractNumId="4" w15:restartNumberingAfterBreak="0">
+  <w:abstractNum w:abstractNumId="5" w15:restartNumberingAfterBreak="0">
     <w:nsid w:val="3F3F1963"/>
     <w:multiLevelType w:val="multilevel"/>
     <w:tmpl w:val="27EE5F7E"/>
@@ -2348,7 +2158,7 @@
       </w:rPr>
     </w:lvl>
   </w:abstractNum>
-  <w:abstractNum w:abstractNumId="5" w15:restartNumberingAfterBreak="0">
+  <w:abstractNum w:abstractNumId="6" w15:restartNumberingAfterBreak="0">
     <w:nsid w:val="3F5D0471"/>
     <w:multiLevelType w:val="multilevel"/>
     <w:tmpl w:val="041E30AA"/>
@@ -2497,7 +2307,7 @@
       </w:rPr>
     </w:lvl>
   </w:abstractNum>
-  <w:abstractNum w:abstractNumId="6" w15:restartNumberingAfterBreak="0">
+  <w:abstractNum w:abstractNumId="7" w15:restartNumberingAfterBreak="0">
     <w:nsid w:val="504A6642"/>
     <w:multiLevelType w:val="multilevel"/>
     <w:tmpl w:val="7248B4E0"/>
@@ -2646,7 +2456,7 @@
       </w:rPr>
     </w:lvl>
   </w:abstractNum>
-  <w:abstractNum w:abstractNumId="7" w15:restartNumberingAfterBreak="0">
+  <w:abstractNum w:abstractNumId="8" w15:restartNumberingAfterBreak="0">
     <w:nsid w:val="64FD7D33"/>
     <w:multiLevelType w:val="multilevel"/>
     <w:tmpl w:val="A580B7F0"/>
@@ -2795,7 +2605,7 @@
       </w:rPr>
     </w:lvl>
   </w:abstractNum>
-  <w:abstractNum w:abstractNumId="8" w15:restartNumberingAfterBreak="0">
+  <w:abstractNum w:abstractNumId="9" w15:restartNumberingAfterBreak="0">
     <w:nsid w:val="711B5ED1"/>
     <w:multiLevelType w:val="multilevel"/>
     <w:tmpl w:val="A40E39F8"/>
@@ -2944,7 +2754,7 @@
       </w:rPr>
     </w:lvl>
   </w:abstractNum>
-  <w:abstractNum w:abstractNumId="9" w15:restartNumberingAfterBreak="0">
+  <w:abstractNum w:abstractNumId="10" w15:restartNumberingAfterBreak="0">
     <w:nsid w:val="77635140"/>
     <w:multiLevelType w:val="multilevel"/>
     <w:tmpl w:val="A7C85168"/>
@@ -3094,34 +2904,37 @@
     </w:lvl>
   </w:abstractNum>
   <w:num w:numId="1" w16cid:durableId="104425265">
-    <w:abstractNumId w:val="7"/>
+    <w:abstractNumId w:val="8"/>
   </w:num>
   <w:num w:numId="2" w16cid:durableId="846334384">
     <w:abstractNumId w:val="1"/>
   </w:num>
   <w:num w:numId="3" w16cid:durableId="859733256">
-    <w:abstractNumId w:val="6"/>
+    <w:abstractNumId w:val="7"/>
   </w:num>
   <w:num w:numId="4" w16cid:durableId="1021784429">
-    <w:abstractNumId w:val="9"/>
+    <w:abstractNumId w:val="10"/>
   </w:num>
   <w:num w:numId="5" w16cid:durableId="416093399">
-    <w:abstractNumId w:val="8"/>
+    <w:abstractNumId w:val="9"/>
   </w:num>
   <w:num w:numId="6" w16cid:durableId="287008993">
     <w:abstractNumId w:val="2"/>
   </w:num>
   <w:num w:numId="7" w16cid:durableId="1512883">
+    <w:abstractNumId w:val="5"/>
+  </w:num>
+  <w:num w:numId="8" w16cid:durableId="234316043">
     <w:abstractNumId w:val="4"/>
   </w:num>
-  <w:num w:numId="8" w16cid:durableId="234316043">
-    <w:abstractNumId w:val="3"/>
-  </w:num>
   <w:num w:numId="9" w16cid:durableId="674040438">
-    <w:abstractNumId w:val="5"/>
+    <w:abstractNumId w:val="6"/>
   </w:num>
   <w:num w:numId="10" w16cid:durableId="1656913910">
     <w:abstractNumId w:val="0"/>
+  </w:num>
+  <w:num w:numId="11" w16cid:durableId="1412846354">
+    <w:abstractNumId w:val="3"/>
   </w:num>
 </w:numbering>
 </file>
@@ -3729,6 +3542,7 @@
   <w:style w:type="character" w:default="1" w:styleId="Fontepargpadro">
     <w:name w:val="Default Paragraph Font"/>
     <w:uiPriority w:val="1"/>
+    <w:semiHidden/>
     <w:unhideWhenUsed/>
   </w:style>
   <w:style w:type="table" w:default="1" w:styleId="Tabelanormal">

</xml_diff>